<commit_message>
docs: update architecture, roadmap, SOPs, spec audit, and todo
</commit_message>
<xml_diff>
--- a/ACC_Admin_SOP.docx
+++ b/ACC_Admin_SOP.docx
@@ -72,7 +72,7 @@
                 <w:sz w:val="22"/>
                 <w:szCs w:val="22"/>
               </w:rPr>
-              <w:t xml:space="preserve">Site Administration — accwebsite.org</w:t>
+              <w:t xml:space="preserve">Site Administration — advancedcabinets.org</w:t>
             </w:r>
           </w:p>
         </w:tc>
@@ -360,7 +360,7 @@
           <w:sz w:val="20"/>
           <w:szCs w:val="20"/>
         </w:rPr>
-        <w:t xml:space="preserve">Enter your email address and password.</w:t>
+        <w:t xml:space="preserve">Enter your email address or username, and password.</w:t>
       </w:r>
     </w:p>
     <w:p>
@@ -701,7 +701,7 @@
           <w:sz w:val="18"/>
           <w:szCs w:val="18"/>
         </w:rPr>
-        <w:t xml:space="preserve">All fields except client name are optional at intake — you can fill them in later via Edit.</w:t>
+        <w:t xml:space="preserve">Required fields are Client Name and Site Address — all other fields are optional at intake and can be filled in later via Edit.</w:t>
       </w:r>
     </w:p>
     <w:p>
@@ -1967,7 +1967,7 @@
           <w:sz w:val="20"/>
           <w:szCs w:val="20"/>
         </w:rPr>
-        <w:t xml:space="preserve">Open the job detail page for the job.</w:t>
+        <w:t xml:space="preserve">Go to www.advancedcabinets.org/schedule (the wall calendar).</w:t>
       </w:r>
     </w:p>
     <w:p>
@@ -1986,7 +1986,7 @@
           <w:sz w:val="20"/>
           <w:szCs w:val="20"/>
         </w:rPr>
-        <w:t xml:space="preserve">Click "Install Phases &amp; Schedule."</w:t>
+        <w:t xml:space="preserve">Click "+ Add Event" in the top-right corner.</w:t>
       </w:r>
     </w:p>
     <w:p>
@@ -2005,7 +2005,7 @@
           <w:sz w:val="20"/>
           <w:szCs w:val="20"/>
         </w:rPr>
-        <w:t xml:space="preserve">Click "+ Add Event."</w:t>
+        <w:t xml:space="preserve">Select the job and event type. Choose a start date and duration (working days).</w:t>
       </w:r>
     </w:p>
     <w:p>
@@ -2024,26 +2024,7 @@
           <w:sz w:val="20"/>
           <w:szCs w:val="20"/>
         </w:rPr>
-        <w:t xml:space="preserve">Choose event type, start date, and duration (working days).</w:t>
-      </w:r>
-    </w:p>
-    <w:p>
-      <w:pPr>
-        <w:pStyle w:val="ListParagraph"/>
-        <w:numPr>
-          <w:ilvl w:val="0"/>
-          <w:numId w:val="2"/>
-        </w:numPr>
-        <w:spacing w:after="60" w:before="60"/>
-      </w:pPr>
-      <w:r>
-        <w:rPr>
-          <w:rFonts w:ascii="Arial" w:cs="Arial" w:eastAsia="Arial" w:hAnsi="Arial"/>
-          <w:color w:val="1a1a1a"/>
-          <w:sz w:val="20"/>
-          <w:szCs w:val="20"/>
-        </w:rPr>
-        <w:t xml:space="preserve">Click "Save." The event appears on the calendar immediately.</w:t>
+        <w:t xml:space="preserve">Click "Save Event." The event appears on the calendar immediately.</w:t>
       </w:r>
     </w:p>
     <w:p>
@@ -2118,7 +2099,7 @@
           <w:sz w:val="20"/>
           <w:szCs w:val="20"/>
         </w:rPr>
-        <w:t xml:space="preserve">Staff accounts control who can log in to the internal site. Go to www.advancedcabinets.org/admin/builders (you may need to log into the admin panel at /admin/login first with the admin password).</w:t>
+        <w:t xml:space="preserve">Staff accounts control who can log in to the internal site. Go to www.advancedcabinets.org/admin/builders (log in at /login with your email or username and password if not already signed in).</w:t>
       </w:r>
     </w:p>
     <w:p>
@@ -2172,7 +2153,7 @@
           <w:sz w:val="20"/>
           <w:szCs w:val="20"/>
         </w:rPr>
-        <w:t xml:space="preserve">Fill in the form: username (email), password, display name, company, email, phone.</w:t>
+        <w:t xml:space="preserve">Fill in the form: username, password, full name, company, email, phone.</w:t>
       </w:r>
     </w:p>
     <w:p>
@@ -2202,7 +2183,7 @@
           <w:sz w:val="18"/>
           <w:szCs w:val="18"/>
         </w:rPr>
-        <w:t xml:space="preserve">  — user = PM, engineer = engineering, admin = full access.</w:t>
+        <w:t xml:space="preserve">  — user = PM, engineer = engineering queue (/engineer), installer = mobile install view (/installer), partner = builder portal access, admin = full access.</w:t>
       </w:r>
     </w:p>
     <w:p>
@@ -2275,7 +2256,7 @@
           <w:sz w:val="20"/>
           <w:szCs w:val="20"/>
         </w:rPr>
-        <w:t xml:space="preserve">Click "Reset Password" next to their name.</w:t>
+        <w:t xml:space="preserve">Click "Reset PW" next to their name.</w:t>
       </w:r>
     </w:p>
     <w:p>
@@ -2496,7 +2477,7 @@
           <w:sz w:val="20"/>
           <w:szCs w:val="20"/>
         </w:rPr>
-        <w:t xml:space="preserve">Click "Create." Hand the credentials to the builder — they will be prompted to change their password on first login.</w:t>
+        <w:t xml:space="preserve">Click "Create Account." Hand the credentials to the builder — they will be prompted to change their password on first login.</w:t>
       </w:r>
     </w:p>
     <w:p>

</xml_diff>